<commit_message>
Update Document d'analyse mandat 1.docx
</commit_message>
<xml_diff>
--- a/Analyse_et_Conception/Document d'analyse mandat 1.docx
+++ b/Analyse_et_Conception/Document d'analyse mandat 1.docx
@@ -4,237 +4,378 @@
   <w:body>
     <w:p>
       <w:pPr>
-        <w:rPr>
-          <w:sz w:val="56"/>
-          <w:szCs w:val="56"/>
-        </w:rPr>
-      </w:pPr>
-      <w:r>
-        <w:rPr>
-          <w:sz w:val="48"/>
-          <w:szCs w:val="48"/>
-        </w:rPr>
-        <w:t xml:space="preserve">                   </w:t>
-      </w:r>
-      <w:r>
-        <w:rPr>
-          <w:sz w:val="56"/>
-          <w:szCs w:val="56"/>
+        <w:jc w:val="center"/>
+        <w:rPr>
+          <w:sz w:val="32"/>
+          <w:szCs w:val="32"/>
+        </w:rPr>
+      </w:pPr>
+    </w:p>
+    <w:p>
+      <w:pPr>
+        <w:jc w:val="center"/>
+        <w:rPr>
+          <w:sz w:val="40"/>
+          <w:szCs w:val="40"/>
+        </w:rPr>
+      </w:pPr>
+      <w:r>
+        <w:rPr>
+          <w:sz w:val="40"/>
+          <w:szCs w:val="40"/>
         </w:rPr>
         <w:t>Document d’analyse</w:t>
       </w:r>
     </w:p>
     <w:p>
       <w:pPr>
-        <w:rPr>
-          <w:sz w:val="48"/>
-          <w:szCs w:val="48"/>
-        </w:rPr>
-      </w:pPr>
-    </w:p>
-    <w:p>
-      <w:pPr>
-        <w:rPr>
-          <w:sz w:val="48"/>
-          <w:szCs w:val="48"/>
-        </w:rPr>
-      </w:pPr>
-    </w:p>
-    <w:p>
-      <w:pPr>
-        <w:rPr>
-          <w:sz w:val="48"/>
-          <w:szCs w:val="48"/>
-        </w:rPr>
-      </w:pPr>
-      <w:r>
-        <w:rPr>
-          <w:sz w:val="48"/>
-          <w:szCs w:val="48"/>
-        </w:rPr>
-        <w:t>Nom : Hichem Khederi</w:t>
-      </w:r>
-    </w:p>
-    <w:p>
-      <w:pPr>
-        <w:rPr>
-          <w:sz w:val="48"/>
-          <w:szCs w:val="48"/>
-        </w:rPr>
-      </w:pPr>
-      <w:r>
-        <w:rPr>
-          <w:sz w:val="48"/>
-          <w:szCs w:val="48"/>
-        </w:rPr>
-        <w:t>Nom : Xavier Pelletier</w:t>
-      </w:r>
-    </w:p>
-    <w:p>
-      <w:pPr>
-        <w:rPr>
-          <w:sz w:val="48"/>
-          <w:szCs w:val="48"/>
+        <w:jc w:val="center"/>
+        <w:rPr>
+          <w:sz w:val="32"/>
+          <w:szCs w:val="32"/>
+        </w:rPr>
+      </w:pPr>
+      <w:r>
+        <w:rPr>
+          <w:sz w:val="32"/>
+          <w:szCs w:val="32"/>
+        </w:rPr>
+        <w:t>Site d’immigration (nom pas encore décidé)</w:t>
+      </w:r>
+    </w:p>
+    <w:p>
+      <w:pPr>
+        <w:rPr>
+          <w:sz w:val="32"/>
+          <w:szCs w:val="32"/>
+        </w:rPr>
+      </w:pPr>
+    </w:p>
+    <w:p>
+      <w:pPr>
+        <w:rPr>
+          <w:sz w:val="32"/>
+          <w:szCs w:val="32"/>
+        </w:rPr>
+      </w:pPr>
+    </w:p>
+    <w:p>
+      <w:pPr>
+        <w:rPr>
+          <w:sz w:val="32"/>
+          <w:szCs w:val="32"/>
+        </w:rPr>
+      </w:pPr>
+    </w:p>
+    <w:p>
+      <w:pPr>
+        <w:jc w:val="center"/>
+        <w:rPr>
+          <w:sz w:val="32"/>
+          <w:szCs w:val="32"/>
+        </w:rPr>
+      </w:pPr>
+      <w:r>
+        <w:rPr>
+          <w:sz w:val="32"/>
+          <w:szCs w:val="32"/>
+        </w:rPr>
+        <w:t>Nom </w:t>
+      </w:r>
+      <w:r>
+        <w:rPr>
+          <w:sz w:val="32"/>
+          <w:szCs w:val="32"/>
+        </w:rPr>
+        <w:t>de l’équipe</w:t>
+      </w:r>
+      <w:r>
+        <w:rPr>
+          <w:sz w:val="32"/>
+          <w:szCs w:val="32"/>
+        </w:rPr>
+        <w:t xml:space="preserve">: </w:t>
+      </w:r>
+    </w:p>
+    <w:p>
+      <w:pPr>
+        <w:jc w:val="center"/>
+        <w:rPr>
+          <w:sz w:val="32"/>
+          <w:szCs w:val="32"/>
+          <w:lang w:val="en-US"/>
+        </w:rPr>
+      </w:pPr>
+      <w:r>
+        <w:rPr>
+          <w:sz w:val="32"/>
+          <w:szCs w:val="32"/>
+          <w:lang w:val="en-US"/>
+        </w:rPr>
+        <w:t xml:space="preserve">Hichem </w:t>
+      </w:r>
+      <w:proofErr w:type="spellStart"/>
+      <w:r>
+        <w:rPr>
+          <w:sz w:val="32"/>
+          <w:szCs w:val="32"/>
+          <w:lang w:val="en-US"/>
+        </w:rPr>
+        <w:t>Khederi</w:t>
+      </w:r>
+      <w:proofErr w:type="spellEnd"/>
+    </w:p>
+    <w:p>
+      <w:pPr>
+        <w:jc w:val="center"/>
+        <w:rPr>
+          <w:sz w:val="32"/>
+          <w:szCs w:val="32"/>
+          <w:lang w:val="en-US"/>
+        </w:rPr>
+      </w:pPr>
+      <w:r>
+        <w:rPr>
+          <w:sz w:val="32"/>
+          <w:szCs w:val="32"/>
+          <w:lang w:val="en-US"/>
+        </w:rPr>
+        <w:t>Xavier Pelletier</w:t>
+      </w:r>
+    </w:p>
+    <w:p>
+      <w:pPr>
+        <w:jc w:val="center"/>
+        <w:rPr>
+          <w:sz w:val="32"/>
+          <w:szCs w:val="32"/>
           <w:lang w:val="en-CA"/>
         </w:rPr>
       </w:pPr>
       <w:r>
         <w:rPr>
-          <w:sz w:val="48"/>
-          <w:szCs w:val="48"/>
+          <w:sz w:val="32"/>
+          <w:szCs w:val="32"/>
           <w:lang w:val="en-CA"/>
         </w:rPr>
-        <w:t>Nom:</w:t>
-      </w:r>
-      <w:r>
-        <w:rPr>
-          <w:sz w:val="48"/>
-          <w:szCs w:val="48"/>
+        <w:t>Eric Christian</w:t>
+      </w:r>
+      <w:r>
+        <w:rPr>
+          <w:sz w:val="32"/>
+          <w:szCs w:val="32"/>
           <w:lang w:val="en-CA"/>
         </w:rPr>
         <w:t xml:space="preserve"> </w:t>
       </w:r>
-      <w:r>
-        <w:rPr>
-          <w:sz w:val="48"/>
-          <w:szCs w:val="48"/>
+      <w:proofErr w:type="spellStart"/>
+      <w:r>
+        <w:rPr>
+          <w:sz w:val="32"/>
+          <w:szCs w:val="32"/>
           <w:lang w:val="en-CA"/>
         </w:rPr>
-        <w:t>Gouife A Djiben, Eric Christian</w:t>
-      </w:r>
-    </w:p>
-    <w:p>
-      <w:pPr>
-        <w:rPr>
-          <w:sz w:val="48"/>
-          <w:szCs w:val="48"/>
-        </w:rPr>
-      </w:pPr>
-      <w:r>
-        <w:rPr>
-          <w:sz w:val="48"/>
-          <w:szCs w:val="48"/>
-        </w:rPr>
-        <w:t xml:space="preserve">Nom: </w:t>
-      </w:r>
-      <w:r>
-        <w:rPr>
-          <w:sz w:val="48"/>
-          <w:szCs w:val="48"/>
-        </w:rPr>
-        <w:t>Ilunga Katanga, Glodi</w:t>
-      </w:r>
-      <w:r>
-        <w:rPr>
-          <w:sz w:val="48"/>
-          <w:szCs w:val="48"/>
-        </w:rPr>
-        <w:t>e</w:t>
-      </w:r>
-    </w:p>
-    <w:p>
-      <w:pPr>
-        <w:rPr>
-          <w:sz w:val="48"/>
-          <w:szCs w:val="48"/>
-        </w:rPr>
-      </w:pPr>
-    </w:p>
-    <w:p>
-      <w:pPr>
-        <w:rPr>
-          <w:sz w:val="48"/>
-          <w:szCs w:val="48"/>
-        </w:rPr>
-      </w:pPr>
-    </w:p>
-    <w:p>
-      <w:pPr>
-        <w:rPr>
-          <w:sz w:val="48"/>
-          <w:szCs w:val="48"/>
-        </w:rPr>
-      </w:pPr>
-    </w:p>
-    <w:p>
-      <w:pPr>
-        <w:rPr>
-          <w:sz w:val="48"/>
-          <w:szCs w:val="48"/>
-        </w:rPr>
-      </w:pPr>
-    </w:p>
-    <w:p>
-      <w:pPr>
-        <w:rPr>
-          <w:sz w:val="48"/>
-          <w:szCs w:val="48"/>
-        </w:rPr>
-      </w:pPr>
-    </w:p>
-    <w:p>
-      <w:pPr>
-        <w:rPr>
-          <w:sz w:val="48"/>
-          <w:szCs w:val="48"/>
-        </w:rPr>
-      </w:pPr>
-    </w:p>
-    <w:p>
-      <w:pPr>
-        <w:rPr>
-          <w:sz w:val="48"/>
-          <w:szCs w:val="48"/>
-        </w:rPr>
-      </w:pPr>
-    </w:p>
-    <w:p>
-      <w:pPr>
-        <w:rPr>
-          <w:sz w:val="48"/>
-          <w:szCs w:val="48"/>
-        </w:rPr>
-      </w:pPr>
-    </w:p>
-    <w:p>
-      <w:pPr>
-        <w:rPr>
-          <w:sz w:val="48"/>
-          <w:szCs w:val="48"/>
-        </w:rPr>
-      </w:pPr>
-    </w:p>
-    <w:p>
-      <w:pPr>
-        <w:rPr>
-          <w:sz w:val="48"/>
-          <w:szCs w:val="48"/>
-        </w:rPr>
-      </w:pPr>
-    </w:p>
-    <w:p>
-      <w:pPr>
-        <w:rPr>
-          <w:sz w:val="48"/>
-          <w:szCs w:val="48"/>
-        </w:rPr>
-      </w:pPr>
-    </w:p>
-    <w:p>
-      <w:pPr>
-        <w:rPr>
-          <w:sz w:val="48"/>
-          <w:szCs w:val="48"/>
-        </w:rPr>
-      </w:pPr>
-    </w:p>
-    <w:p>
-      <w:pPr>
+        <w:t>Gouife</w:t>
+      </w:r>
+      <w:proofErr w:type="spellEnd"/>
+      <w:r>
+        <w:rPr>
+          <w:sz w:val="32"/>
+          <w:szCs w:val="32"/>
+          <w:lang w:val="en-CA"/>
+        </w:rPr>
+        <w:t xml:space="preserve"> </w:t>
+      </w:r>
+      <w:proofErr w:type="gramStart"/>
+      <w:r>
+        <w:rPr>
+          <w:sz w:val="32"/>
+          <w:szCs w:val="32"/>
+          <w:lang w:val="en-CA"/>
+        </w:rPr>
+        <w:t>A</w:t>
+      </w:r>
+      <w:proofErr w:type="gramEnd"/>
+      <w:r>
+        <w:rPr>
+          <w:sz w:val="32"/>
+          <w:szCs w:val="32"/>
+          <w:lang w:val="en-CA"/>
+        </w:rPr>
+        <w:t xml:space="preserve"> </w:t>
+      </w:r>
+      <w:proofErr w:type="spellStart"/>
+      <w:r>
+        <w:rPr>
+          <w:sz w:val="32"/>
+          <w:szCs w:val="32"/>
+          <w:lang w:val="en-CA"/>
+        </w:rPr>
+        <w:t>Djiben</w:t>
+      </w:r>
+      <w:proofErr w:type="spellEnd"/>
+    </w:p>
+    <w:p>
+      <w:pPr>
+        <w:jc w:val="center"/>
+        <w:rPr>
+          <w:sz w:val="32"/>
+          <w:szCs w:val="32"/>
+          <w:lang w:val="en-US"/>
+        </w:rPr>
+      </w:pPr>
+      <w:proofErr w:type="spellStart"/>
+      <w:r>
+        <w:rPr>
+          <w:sz w:val="32"/>
+          <w:szCs w:val="32"/>
+          <w:lang w:val="en-US"/>
+        </w:rPr>
+        <w:t>Glodie</w:t>
+      </w:r>
+      <w:proofErr w:type="spellEnd"/>
+      <w:r>
+        <w:rPr>
+          <w:sz w:val="32"/>
+          <w:szCs w:val="32"/>
+          <w:lang w:val="en-US"/>
+        </w:rPr>
+        <w:t xml:space="preserve"> </w:t>
+      </w:r>
+      <w:r>
+        <w:rPr>
+          <w:sz w:val="32"/>
+          <w:szCs w:val="32"/>
+          <w:lang w:val="en-US"/>
+        </w:rPr>
+        <w:t>Ilunga Katanga</w:t>
+      </w:r>
+    </w:p>
+    <w:p>
+      <w:pPr>
+        <w:rPr>
+          <w:sz w:val="32"/>
+          <w:szCs w:val="32"/>
+          <w:lang w:val="en-US"/>
+        </w:rPr>
+      </w:pPr>
+    </w:p>
+    <w:p>
+      <w:pPr>
+        <w:rPr>
+          <w:sz w:val="32"/>
+          <w:szCs w:val="32"/>
+          <w:lang w:val="en-US"/>
+        </w:rPr>
+      </w:pPr>
+    </w:p>
+    <w:p>
+      <w:pPr>
+        <w:rPr>
+          <w:sz w:val="32"/>
+          <w:szCs w:val="32"/>
+          <w:lang w:val="en-US"/>
+        </w:rPr>
+      </w:pPr>
+    </w:p>
+    <w:p>
+      <w:pPr>
+        <w:rPr>
+          <w:sz w:val="32"/>
+          <w:szCs w:val="32"/>
+          <w:lang w:val="en-US"/>
+        </w:rPr>
+      </w:pPr>
+    </w:p>
+    <w:p>
+      <w:pPr>
+        <w:rPr>
+          <w:sz w:val="32"/>
+          <w:szCs w:val="32"/>
+          <w:lang w:val="en-US"/>
+        </w:rPr>
+      </w:pPr>
+    </w:p>
+    <w:p>
+      <w:pPr>
+        <w:rPr>
+          <w:sz w:val="32"/>
+          <w:szCs w:val="32"/>
+          <w:lang w:val="en-US"/>
+        </w:rPr>
+      </w:pPr>
+    </w:p>
+    <w:p>
+      <w:pPr>
+        <w:rPr>
+          <w:sz w:val="32"/>
+          <w:szCs w:val="32"/>
+          <w:lang w:val="en-US"/>
+        </w:rPr>
+      </w:pPr>
+    </w:p>
+    <w:p>
+      <w:pPr>
+        <w:jc w:val="center"/>
+        <w:rPr>
+          <w:sz w:val="32"/>
+          <w:szCs w:val="32"/>
+        </w:rPr>
+      </w:pPr>
+      <w:r>
+        <w:rPr>
+          <w:sz w:val="32"/>
+          <w:szCs w:val="32"/>
+        </w:rPr>
+        <w:t>Projet 2</w:t>
+      </w:r>
+      <w:r>
+        <w:rPr>
+          <w:sz w:val="32"/>
+          <w:szCs w:val="32"/>
+        </w:rPr>
+        <w:t xml:space="preserve"> : Mandat 1</w:t>
+      </w:r>
+    </w:p>
+    <w:p>
+      <w:pPr>
+        <w:jc w:val="center"/>
+        <w:rPr>
+          <w:sz w:val="32"/>
+          <w:szCs w:val="32"/>
+        </w:rPr>
+      </w:pPr>
+      <w:r>
+        <w:rPr>
+          <w:sz w:val="32"/>
+          <w:szCs w:val="32"/>
+        </w:rPr>
+        <w:t>Collège de M</w:t>
+      </w:r>
+      <w:r>
+        <w:rPr>
+          <w:sz w:val="32"/>
+          <w:szCs w:val="32"/>
+        </w:rPr>
+        <w:t>aisonneuve</w:t>
+      </w:r>
+    </w:p>
+    <w:p>
+      <w:pPr>
+        <w:rPr>
+          <w:sz w:val="32"/>
+          <w:szCs w:val="32"/>
+        </w:rPr>
+      </w:pPr>
+    </w:p>
+    <w:p>
+      <w:pPr>
+        <w:jc w:val="both"/>
         <w:rPr>
           <w:b/>
           <w:bCs/>
-          <w:sz w:val="32"/>
-          <w:szCs w:val="32"/>
+          <w:sz w:val="22"/>
+          <w:szCs w:val="22"/>
           <w:u w:val="single"/>
         </w:rPr>
       </w:pPr>
@@ -242,251 +383,223 @@
         <w:rPr>
           <w:b/>
           <w:bCs/>
-          <w:sz w:val="32"/>
-          <w:szCs w:val="32"/>
+          <w:sz w:val="22"/>
+          <w:szCs w:val="22"/>
           <w:u w:val="single"/>
         </w:rPr>
+        <w:lastRenderedPageBreak/>
         <w:t>Contexte du client</w:t>
       </w:r>
     </w:p>
     <w:p>
       <w:pPr>
-        <w:rPr>
-          <w:sz w:val="32"/>
-          <w:szCs w:val="32"/>
-        </w:rPr>
-      </w:pPr>
-      <w:r>
-        <w:rPr>
-          <w:sz w:val="32"/>
-          <w:szCs w:val="32"/>
+        <w:jc w:val="both"/>
+        <w:rPr>
+          <w:sz w:val="22"/>
+          <w:szCs w:val="22"/>
+        </w:rPr>
+      </w:pPr>
+      <w:r>
+        <w:rPr>
+          <w:sz w:val="22"/>
+          <w:szCs w:val="22"/>
         </w:rPr>
         <w:t>Ce projet</w:t>
       </w:r>
       <w:r>
         <w:rPr>
-          <w:sz w:val="32"/>
-          <w:szCs w:val="32"/>
+          <w:sz w:val="22"/>
+          <w:szCs w:val="22"/>
         </w:rPr>
         <w:t xml:space="preserve"> va permettre aux </w:t>
       </w:r>
       <w:r>
         <w:rPr>
-          <w:sz w:val="32"/>
-          <w:szCs w:val="32"/>
+          <w:sz w:val="22"/>
+          <w:szCs w:val="22"/>
         </w:rPr>
         <w:t xml:space="preserve">immigrants de soumettre </w:t>
       </w:r>
       <w:r>
         <w:rPr>
-          <w:sz w:val="32"/>
-          <w:szCs w:val="32"/>
+          <w:sz w:val="22"/>
+          <w:szCs w:val="22"/>
         </w:rPr>
         <w:t>leur demande</w:t>
       </w:r>
       <w:r>
         <w:rPr>
-          <w:sz w:val="32"/>
-          <w:szCs w:val="32"/>
+          <w:sz w:val="22"/>
+          <w:szCs w:val="22"/>
         </w:rPr>
         <w:t xml:space="preserve"> d’immigration plus facilement</w:t>
       </w:r>
       <w:r>
         <w:rPr>
-          <w:sz w:val="32"/>
-          <w:szCs w:val="32"/>
+          <w:sz w:val="22"/>
+          <w:szCs w:val="22"/>
         </w:rPr>
         <w:t xml:space="preserve"> </w:t>
       </w:r>
       <w:r>
         <w:rPr>
-          <w:sz w:val="32"/>
-          <w:szCs w:val="32"/>
+          <w:sz w:val="22"/>
+          <w:szCs w:val="22"/>
         </w:rPr>
         <w:t>pour un cabinet de services professionnels r</w:t>
       </w:r>
       <w:r>
         <w:rPr>
-          <w:sz w:val="32"/>
-          <w:szCs w:val="32"/>
+          <w:sz w:val="22"/>
+          <w:szCs w:val="22"/>
         </w:rPr>
         <w:t>églementés au Cameroun.</w:t>
       </w:r>
       <w:r>
         <w:rPr>
-          <w:sz w:val="32"/>
-          <w:szCs w:val="32"/>
+          <w:sz w:val="22"/>
+          <w:szCs w:val="22"/>
         </w:rPr>
         <w:t xml:space="preserve"> Étant donné </w:t>
       </w:r>
       <w:r>
         <w:rPr>
-          <w:sz w:val="32"/>
-          <w:szCs w:val="32"/>
+          <w:sz w:val="22"/>
+          <w:szCs w:val="22"/>
         </w:rPr>
         <w:t>le nombre élevé</w:t>
       </w:r>
       <w:r>
         <w:rPr>
-          <w:sz w:val="32"/>
-          <w:szCs w:val="32"/>
+          <w:sz w:val="22"/>
+          <w:szCs w:val="22"/>
         </w:rPr>
         <w:t xml:space="preserve"> de demandes chaque année,</w:t>
       </w:r>
       <w:r>
         <w:rPr>
-          <w:sz w:val="32"/>
-          <w:szCs w:val="32"/>
+          <w:sz w:val="22"/>
+          <w:szCs w:val="22"/>
         </w:rPr>
         <w:t xml:space="preserve"> cela permettra</w:t>
       </w:r>
       <w:r>
         <w:rPr>
-          <w:sz w:val="32"/>
-          <w:szCs w:val="32"/>
+          <w:sz w:val="22"/>
+          <w:szCs w:val="22"/>
         </w:rPr>
         <w:t xml:space="preserve"> aux employés</w:t>
       </w:r>
       <w:r>
         <w:rPr>
-          <w:sz w:val="32"/>
-          <w:szCs w:val="32"/>
+          <w:sz w:val="22"/>
+          <w:szCs w:val="22"/>
         </w:rPr>
         <w:t xml:space="preserve"> de mieux </w:t>
       </w:r>
       <w:r>
         <w:rPr>
-          <w:sz w:val="32"/>
-          <w:szCs w:val="32"/>
+          <w:sz w:val="22"/>
+          <w:szCs w:val="22"/>
         </w:rPr>
         <w:t>gérer le</w:t>
       </w:r>
       <w:r>
         <w:rPr>
-          <w:sz w:val="32"/>
-          <w:szCs w:val="32"/>
+          <w:sz w:val="22"/>
+          <w:szCs w:val="22"/>
         </w:rPr>
         <w:t xml:space="preserve">s </w:t>
       </w:r>
       <w:r>
         <w:rPr>
-          <w:sz w:val="32"/>
-          <w:szCs w:val="32"/>
+          <w:sz w:val="22"/>
+          <w:szCs w:val="22"/>
         </w:rPr>
         <w:t>demande</w:t>
       </w:r>
       <w:r>
         <w:rPr>
-          <w:sz w:val="32"/>
-          <w:szCs w:val="32"/>
+          <w:sz w:val="22"/>
+          <w:szCs w:val="22"/>
         </w:rPr>
         <w:t>s</w:t>
       </w:r>
       <w:r>
         <w:rPr>
-          <w:sz w:val="32"/>
-          <w:szCs w:val="32"/>
+          <w:sz w:val="22"/>
+          <w:szCs w:val="22"/>
         </w:rPr>
         <w:t xml:space="preserve"> </w:t>
       </w:r>
       <w:r>
         <w:rPr>
-          <w:sz w:val="32"/>
-          <w:szCs w:val="32"/>
+          <w:sz w:val="22"/>
+          <w:szCs w:val="22"/>
         </w:rPr>
         <w:t xml:space="preserve">et </w:t>
       </w:r>
       <w:r>
         <w:rPr>
-          <w:sz w:val="32"/>
-          <w:szCs w:val="32"/>
+          <w:sz w:val="22"/>
+          <w:szCs w:val="22"/>
         </w:rPr>
         <w:t>ainsi</w:t>
       </w:r>
       <w:r>
         <w:rPr>
-          <w:sz w:val="32"/>
-          <w:szCs w:val="32"/>
+          <w:sz w:val="22"/>
+          <w:szCs w:val="22"/>
         </w:rPr>
         <w:t xml:space="preserve"> éviter </w:t>
       </w:r>
       <w:r>
         <w:rPr>
-          <w:sz w:val="32"/>
-          <w:szCs w:val="32"/>
+          <w:sz w:val="22"/>
+          <w:szCs w:val="22"/>
         </w:rPr>
         <w:t>les longs délais</w:t>
       </w:r>
       <w:r>
         <w:rPr>
-          <w:sz w:val="32"/>
-          <w:szCs w:val="32"/>
+          <w:sz w:val="22"/>
+          <w:szCs w:val="22"/>
         </w:rPr>
         <w:t xml:space="preserve"> d’attente</w:t>
       </w:r>
       <w:r>
         <w:rPr>
-          <w:sz w:val="32"/>
-          <w:szCs w:val="32"/>
+          <w:sz w:val="22"/>
+          <w:szCs w:val="22"/>
         </w:rPr>
         <w:t xml:space="preserve"> pour chaque </w:t>
       </w:r>
       <w:r>
         <w:rPr>
-          <w:sz w:val="32"/>
-          <w:szCs w:val="32"/>
+          <w:sz w:val="22"/>
+          <w:szCs w:val="22"/>
         </w:rPr>
         <w:t>client.</w:t>
       </w:r>
     </w:p>
     <w:p>
       <w:pPr>
-        <w:rPr>
-          <w:sz w:val="32"/>
-          <w:szCs w:val="32"/>
-        </w:rPr>
-      </w:pPr>
-    </w:p>
-    <w:p>
-      <w:pPr>
-        <w:rPr>
-          <w:sz w:val="32"/>
-          <w:szCs w:val="32"/>
-        </w:rPr>
-      </w:pPr>
-    </w:p>
-    <w:p>
-      <w:pPr>
-        <w:rPr>
-          <w:sz w:val="32"/>
-          <w:szCs w:val="32"/>
-        </w:rPr>
-      </w:pPr>
-    </w:p>
-    <w:p>
-      <w:pPr>
-        <w:rPr>
-          <w:sz w:val="32"/>
-          <w:szCs w:val="32"/>
-        </w:rPr>
-      </w:pPr>
-    </w:p>
-    <w:p>
-      <w:pPr>
-        <w:rPr>
-          <w:sz w:val="32"/>
-          <w:szCs w:val="32"/>
+        <w:jc w:val="both"/>
+        <w:rPr>
+          <w:sz w:val="22"/>
+          <w:szCs w:val="22"/>
         </w:rPr>
       </w:pPr>
     </w:p>
     <w:p>
       <w:pPr>
         <w:pStyle w:val="Paragraphedeliste"/>
+        <w:jc w:val="both"/>
         <w:rPr>
           <w:b/>
           <w:bCs/>
-          <w:sz w:val="32"/>
-          <w:szCs w:val="32"/>
+          <w:sz w:val="22"/>
+          <w:szCs w:val="22"/>
           <w:u w:val="single"/>
         </w:rPr>
       </w:pPr>
@@ -494,8 +607,8 @@
         <w:rPr>
           <w:b/>
           <w:bCs/>
-          <w:sz w:val="32"/>
-          <w:szCs w:val="32"/>
+          <w:sz w:val="22"/>
+          <w:szCs w:val="22"/>
           <w:u w:val="single"/>
         </w:rPr>
         <w:t>Objectifs de l’application</w:t>
@@ -508,17 +621,32 @@
           <w:ilvl w:val="0"/>
           <w:numId w:val="2"/>
         </w:numPr>
-        <w:rPr>
-          <w:sz w:val="32"/>
-          <w:szCs w:val="32"/>
-        </w:rPr>
-      </w:pPr>
-      <w:r>
-        <w:rPr>
-          <w:sz w:val="32"/>
-          <w:szCs w:val="32"/>
-        </w:rPr>
-        <w:t>Gérer les clients du cabinet d’immigration et leurs informations personnelles</w:t>
+        <w:jc w:val="both"/>
+        <w:rPr>
+          <w:sz w:val="22"/>
+          <w:szCs w:val="22"/>
+        </w:rPr>
+      </w:pPr>
+      <w:r>
+        <w:rPr>
+          <w:sz w:val="22"/>
+          <w:szCs w:val="22"/>
+        </w:rPr>
+        <w:t>Gérer les clients du cabinet d’immigration</w:t>
+      </w:r>
+      <w:r>
+        <w:rPr>
+          <w:sz w:val="22"/>
+          <w:szCs w:val="22"/>
+        </w:rPr>
+        <w:t xml:space="preserve"> ainsi </w:t>
+      </w:r>
+      <w:r>
+        <w:rPr>
+          <w:sz w:val="22"/>
+          <w:szCs w:val="22"/>
+        </w:rPr>
+        <w:t>leurs informations personnelles</w:t>
       </w:r>
     </w:p>
     <w:p>
@@ -528,17 +656,32 @@
           <w:ilvl w:val="0"/>
           <w:numId w:val="2"/>
         </w:numPr>
-        <w:rPr>
-          <w:sz w:val="32"/>
-          <w:szCs w:val="32"/>
-        </w:rPr>
-      </w:pPr>
-      <w:r>
-        <w:rPr>
-          <w:sz w:val="32"/>
-          <w:szCs w:val="32"/>
-        </w:rPr>
-        <w:t>Créer, suivre et mettre à jour les dossiers d’immigration (types de demandes, statuts, échéances)</w:t>
+        <w:jc w:val="both"/>
+        <w:rPr>
+          <w:sz w:val="22"/>
+          <w:szCs w:val="22"/>
+        </w:rPr>
+      </w:pPr>
+      <w:r>
+        <w:rPr>
+          <w:sz w:val="22"/>
+          <w:szCs w:val="22"/>
+        </w:rPr>
+        <w:t xml:space="preserve">Créer, suivre et mettre à jour </w:t>
+      </w:r>
+      <w:r>
+        <w:rPr>
+          <w:sz w:val="22"/>
+          <w:szCs w:val="22"/>
+        </w:rPr>
+        <w:t>d</w:t>
+      </w:r>
+      <w:r>
+        <w:rPr>
+          <w:sz w:val="22"/>
+          <w:szCs w:val="22"/>
+        </w:rPr>
+        <w:t>es dossiers d’immigration (types de demandes, statuts, échéances)</w:t>
       </w:r>
     </w:p>
     <w:p>
@@ -548,17 +691,17 @@
           <w:ilvl w:val="0"/>
           <w:numId w:val="2"/>
         </w:numPr>
-        <w:rPr>
-          <w:sz w:val="32"/>
-          <w:szCs w:val="32"/>
-        </w:rPr>
-      </w:pPr>
-      <w:r>
-        <w:rPr>
-          <w:sz w:val="32"/>
-          <w:szCs w:val="32"/>
-        </w:rPr>
-        <w:lastRenderedPageBreak/>
+        <w:jc w:val="both"/>
+        <w:rPr>
+          <w:sz w:val="22"/>
+          <w:szCs w:val="22"/>
+        </w:rPr>
+      </w:pPr>
+      <w:r>
+        <w:rPr>
+          <w:sz w:val="22"/>
+          <w:szCs w:val="22"/>
+        </w:rPr>
         <w:t>Centraliser et organiser les documents officiels liés aux demandes d’immigration</w:t>
       </w:r>
     </w:p>
@@ -569,15 +712,16 @@
           <w:ilvl w:val="0"/>
           <w:numId w:val="2"/>
         </w:numPr>
-        <w:rPr>
-          <w:sz w:val="32"/>
-          <w:szCs w:val="32"/>
-        </w:rPr>
-      </w:pPr>
-      <w:r>
-        <w:rPr>
-          <w:sz w:val="32"/>
-          <w:szCs w:val="32"/>
+        <w:jc w:val="both"/>
+        <w:rPr>
+          <w:sz w:val="22"/>
+          <w:szCs w:val="22"/>
+        </w:rPr>
+      </w:pPr>
+      <w:r>
+        <w:rPr>
+          <w:sz w:val="22"/>
+          <w:szCs w:val="22"/>
         </w:rPr>
         <w:t>Assurer le suivi des actions effectuées par les employés sur chaque dossier</w:t>
       </w:r>
@@ -589,15 +733,16 @@
           <w:ilvl w:val="0"/>
           <w:numId w:val="2"/>
         </w:numPr>
-        <w:rPr>
-          <w:sz w:val="32"/>
-          <w:szCs w:val="32"/>
-        </w:rPr>
-      </w:pPr>
-      <w:r>
-        <w:rPr>
-          <w:sz w:val="32"/>
-          <w:szCs w:val="32"/>
+        <w:jc w:val="both"/>
+        <w:rPr>
+          <w:sz w:val="22"/>
+          <w:szCs w:val="22"/>
+        </w:rPr>
+      </w:pPr>
+      <w:r>
+        <w:rPr>
+          <w:sz w:val="22"/>
+          <w:szCs w:val="22"/>
         </w:rPr>
         <w:t>Simplifier la gestion interne du cabinet (notes, historique, facturation)</w:t>
       </w:r>
@@ -605,86 +750,134 @@
     <w:p>
       <w:pPr>
         <w:pStyle w:val="Paragraphedeliste"/>
-        <w:rPr>
-          <w:sz w:val="32"/>
-          <w:szCs w:val="32"/>
-        </w:rPr>
-      </w:pPr>
+        <w:numPr>
+          <w:ilvl w:val="0"/>
+          <w:numId w:val="2"/>
+        </w:numPr>
+        <w:jc w:val="both"/>
+        <w:rPr>
+          <w:sz w:val="22"/>
+          <w:szCs w:val="22"/>
+        </w:rPr>
+      </w:pPr>
+      <w:r>
+        <w:rPr>
+          <w:sz w:val="22"/>
+          <w:szCs w:val="22"/>
+        </w:rPr>
+        <w:t>Facilité l</w:t>
+      </w:r>
+      <w:r>
+        <w:rPr>
+          <w:sz w:val="22"/>
+          <w:szCs w:val="22"/>
+        </w:rPr>
+        <w:t>a création de deman</w:t>
+      </w:r>
+      <w:r>
+        <w:rPr>
+          <w:sz w:val="22"/>
+          <w:szCs w:val="22"/>
+        </w:rPr>
+        <w:t>de</w:t>
+      </w:r>
+      <w:r>
+        <w:rPr>
+          <w:sz w:val="22"/>
+          <w:szCs w:val="22"/>
+        </w:rPr>
+        <w:t xml:space="preserve"> des clients, pour que cela soit rapide et accessible à tous</w:t>
+      </w:r>
+      <w:r>
+        <w:rPr>
+          <w:sz w:val="22"/>
+          <w:szCs w:val="22"/>
+        </w:rPr>
+        <w:t xml:space="preserve"> </w:t>
+      </w:r>
     </w:p>
     <w:p>
       <w:pPr>
         <w:pStyle w:val="Paragraphedeliste"/>
-        <w:rPr>
-          <w:sz w:val="32"/>
-          <w:szCs w:val="32"/>
+        <w:jc w:val="both"/>
+        <w:rPr>
+          <w:sz w:val="22"/>
+          <w:szCs w:val="22"/>
         </w:rPr>
       </w:pPr>
     </w:p>
     <w:p>
       <w:pPr>
         <w:pStyle w:val="Paragraphedeliste"/>
-        <w:rPr>
-          <w:sz w:val="32"/>
-          <w:szCs w:val="32"/>
+        <w:jc w:val="both"/>
+        <w:rPr>
+          <w:sz w:val="22"/>
+          <w:szCs w:val="22"/>
         </w:rPr>
       </w:pPr>
     </w:p>
     <w:p>
       <w:pPr>
         <w:pStyle w:val="Paragraphedeliste"/>
-        <w:rPr>
-          <w:sz w:val="32"/>
-          <w:szCs w:val="32"/>
+        <w:jc w:val="both"/>
+        <w:rPr>
+          <w:sz w:val="22"/>
+          <w:szCs w:val="22"/>
         </w:rPr>
       </w:pPr>
     </w:p>
     <w:p>
       <w:pPr>
         <w:pStyle w:val="Paragraphedeliste"/>
-        <w:rPr>
-          <w:sz w:val="32"/>
-          <w:szCs w:val="32"/>
+        <w:jc w:val="both"/>
+        <w:rPr>
+          <w:sz w:val="22"/>
+          <w:szCs w:val="22"/>
         </w:rPr>
       </w:pPr>
     </w:p>
     <w:p>
       <w:pPr>
         <w:pStyle w:val="Paragraphedeliste"/>
-        <w:rPr>
-          <w:sz w:val="32"/>
-          <w:szCs w:val="32"/>
-        </w:rPr>
-      </w:pPr>
-    </w:p>
-    <w:p>
-      <w:pPr>
+        <w:jc w:val="both"/>
+        <w:rPr>
+          <w:sz w:val="22"/>
+          <w:szCs w:val="22"/>
+        </w:rPr>
+      </w:pPr>
+    </w:p>
+    <w:p>
+      <w:pPr>
+        <w:jc w:val="both"/>
         <w:rPr>
           <w:b/>
           <w:bCs/>
-          <w:sz w:val="32"/>
-          <w:szCs w:val="32"/>
+          <w:sz w:val="22"/>
+          <w:szCs w:val="22"/>
           <w:u w:val="single"/>
         </w:rPr>
       </w:pPr>
     </w:p>
     <w:p>
       <w:pPr>
+        <w:jc w:val="both"/>
         <w:rPr>
           <w:b/>
           <w:bCs/>
-          <w:sz w:val="32"/>
-          <w:szCs w:val="32"/>
+          <w:sz w:val="22"/>
+          <w:szCs w:val="22"/>
           <w:u w:val="single"/>
         </w:rPr>
       </w:pPr>
     </w:p>
     <w:p>
       <w:pPr>
+        <w:jc w:val="both"/>
         <w:rPr>
           <w:b/>
           <w:bCs/>
-          <w:sz w:val="32"/>
-          <w:szCs w:val="32"/>
+          <w:sz w:val="22"/>
+          <w:szCs w:val="22"/>
           <w:u w:val="single"/>
         </w:rPr>
       </w:pPr>
@@ -692,8 +885,8 @@
         <w:rPr>
           <w:b/>
           <w:bCs/>
-          <w:sz w:val="32"/>
-          <w:szCs w:val="32"/>
+          <w:sz w:val="22"/>
+          <w:szCs w:val="22"/>
           <w:u w:val="single"/>
         </w:rPr>
         <w:t>Description des fonctionnalités</w:t>
@@ -701,100 +894,105 @@
     </w:p>
     <w:p>
       <w:pPr>
+        <w:jc w:val="both"/>
         <w:rPr>
           <w:b/>
           <w:bCs/>
-          <w:sz w:val="32"/>
-          <w:szCs w:val="32"/>
+          <w:sz w:val="22"/>
+          <w:szCs w:val="22"/>
           <w:u w:val="single"/>
         </w:rPr>
       </w:pPr>
     </w:p>
     <w:p>
       <w:pPr>
-        <w:rPr>
-          <w:sz w:val="32"/>
-          <w:szCs w:val="32"/>
-        </w:rPr>
-      </w:pPr>
-      <w:r>
-        <w:rPr>
-          <w:sz w:val="32"/>
-          <w:szCs w:val="32"/>
+        <w:jc w:val="both"/>
+        <w:rPr>
+          <w:sz w:val="22"/>
+          <w:szCs w:val="22"/>
+        </w:rPr>
+      </w:pPr>
+      <w:r>
+        <w:rPr>
+          <w:sz w:val="22"/>
+          <w:szCs w:val="22"/>
         </w:rPr>
         <w:t>Il y aura 3 types d</w:t>
       </w:r>
       <w:r>
         <w:rPr>
-          <w:sz w:val="32"/>
-          <w:szCs w:val="32"/>
+          <w:sz w:val="22"/>
+          <w:szCs w:val="22"/>
         </w:rPr>
         <w:t>’acteurs</w:t>
       </w:r>
       <w:r>
         <w:rPr>
-          <w:sz w:val="32"/>
-          <w:szCs w:val="32"/>
+          <w:sz w:val="22"/>
+          <w:szCs w:val="22"/>
         </w:rPr>
         <w:t xml:space="preserve"> dans cette application : Administrateur, Utilisateurs et Clients</w:t>
       </w:r>
       <w:r>
         <w:rPr>
-          <w:sz w:val="32"/>
-          <w:szCs w:val="32"/>
+          <w:sz w:val="22"/>
+          <w:szCs w:val="22"/>
         </w:rPr>
         <w:t xml:space="preserve"> </w:t>
       </w:r>
       <w:r>
         <w:rPr>
-          <w:sz w:val="32"/>
-          <w:szCs w:val="32"/>
+          <w:sz w:val="22"/>
+          <w:szCs w:val="22"/>
         </w:rPr>
         <w:t>dont chacun aura ses propres responsabilités(</w:t>
       </w:r>
       <w:r>
         <w:rPr>
-          <w:sz w:val="32"/>
-          <w:szCs w:val="32"/>
+          <w:sz w:val="22"/>
+          <w:szCs w:val="22"/>
         </w:rPr>
         <w:t>rôles</w:t>
       </w:r>
       <w:r>
         <w:rPr>
-          <w:sz w:val="32"/>
-          <w:szCs w:val="32"/>
+          <w:sz w:val="22"/>
+          <w:szCs w:val="22"/>
         </w:rPr>
         <w:t>)</w:t>
       </w:r>
     </w:p>
     <w:p>
       <w:pPr>
-        <w:rPr>
-          <w:sz w:val="32"/>
-          <w:szCs w:val="32"/>
-        </w:rPr>
-      </w:pPr>
-    </w:p>
-    <w:p>
-      <w:pPr>
-        <w:rPr>
-          <w:sz w:val="32"/>
-          <w:szCs w:val="32"/>
-        </w:rPr>
-      </w:pPr>
-      <w:r>
-        <w:rPr>
-          <w:sz w:val="32"/>
-          <w:szCs w:val="32"/>
+        <w:jc w:val="both"/>
+        <w:rPr>
+          <w:sz w:val="22"/>
+          <w:szCs w:val="22"/>
+        </w:rPr>
+      </w:pPr>
+    </w:p>
+    <w:p>
+      <w:pPr>
+        <w:jc w:val="both"/>
+        <w:rPr>
+          <w:sz w:val="22"/>
+          <w:szCs w:val="22"/>
+        </w:rPr>
+      </w:pPr>
+      <w:r>
+        <w:rPr>
+          <w:sz w:val="22"/>
+          <w:szCs w:val="22"/>
         </w:rPr>
         <w:t>Administrateur :</w:t>
       </w:r>
     </w:p>
     <w:p>
       <w:pPr>
-        <w:rPr>
-          <w:sz w:val="32"/>
-          <w:szCs w:val="32"/>
+        <w:jc w:val="both"/>
+        <w:rPr>
+          <w:sz w:val="22"/>
+          <w:szCs w:val="22"/>
         </w:rPr>
       </w:pPr>
       <w:r>
@@ -802,8 +1000,8 @@
           <w:rFonts w:ascii="Consolas" w:eastAsia="Times New Roman" w:hAnsi="Consolas" w:cs="Times New Roman"/>
           <w:color w:val="CCCCCC"/>
           <w:kern w:val="0"/>
-          <w:sz w:val="21"/>
-          <w:szCs w:val="21"/>
+          <w:sz w:val="22"/>
+          <w:szCs w:val="22"/>
           <w:lang w:eastAsia="fr-CA"/>
           <w14:ligatures w14:val="none"/>
         </w:rPr>
@@ -811,299 +1009,406 @@
       </w:r>
       <w:r>
         <w:rPr>
-          <w:sz w:val="32"/>
-          <w:szCs w:val="32"/>
+          <w:sz w:val="22"/>
+          <w:szCs w:val="22"/>
         </w:rPr>
         <w:t xml:space="preserve">Créer, modifier, activer ou désactiver des utilisateurs </w:t>
       </w:r>
     </w:p>
     <w:p>
       <w:pPr>
-        <w:rPr>
-          <w:sz w:val="32"/>
-          <w:szCs w:val="32"/>
-        </w:rPr>
-      </w:pPr>
-      <w:r>
-        <w:rPr>
-          <w:sz w:val="32"/>
-          <w:szCs w:val="32"/>
+        <w:jc w:val="both"/>
+        <w:rPr>
+          <w:sz w:val="22"/>
+          <w:szCs w:val="22"/>
+        </w:rPr>
+      </w:pPr>
+      <w:r>
+        <w:rPr>
+          <w:sz w:val="22"/>
+          <w:szCs w:val="22"/>
         </w:rPr>
         <w:t xml:space="preserve">- Attribuer les rôles </w:t>
       </w:r>
     </w:p>
     <w:p>
       <w:pPr>
-        <w:rPr>
-          <w:sz w:val="32"/>
-          <w:szCs w:val="32"/>
-        </w:rPr>
-      </w:pPr>
-      <w:r>
-        <w:rPr>
-          <w:sz w:val="32"/>
-          <w:szCs w:val="32"/>
+        <w:jc w:val="both"/>
+        <w:rPr>
+          <w:sz w:val="22"/>
+          <w:szCs w:val="22"/>
+        </w:rPr>
+      </w:pPr>
+      <w:r>
+        <w:rPr>
+          <w:sz w:val="22"/>
+          <w:szCs w:val="22"/>
         </w:rPr>
         <w:t xml:space="preserve">- Accéder à toutes les données du système </w:t>
       </w:r>
     </w:p>
     <w:p>
       <w:pPr>
-        <w:rPr>
-          <w:sz w:val="32"/>
-          <w:szCs w:val="32"/>
-        </w:rPr>
-      </w:pPr>
-      <w:r>
-        <w:rPr>
-          <w:sz w:val="32"/>
-          <w:szCs w:val="32"/>
+        <w:jc w:val="both"/>
+        <w:rPr>
+          <w:sz w:val="22"/>
+          <w:szCs w:val="22"/>
+        </w:rPr>
+      </w:pPr>
+      <w:r>
+        <w:rPr>
+          <w:sz w:val="22"/>
+          <w:szCs w:val="22"/>
+        </w:rPr>
+        <w:t xml:space="preserve">- Créer, modifier et supprimer clients, dossiers, notes, documents et factures </w:t>
+      </w:r>
+    </w:p>
+    <w:p>
+      <w:pPr>
+        <w:jc w:val="both"/>
+        <w:rPr>
+          <w:sz w:val="22"/>
+          <w:szCs w:val="22"/>
+        </w:rPr>
+      </w:pPr>
+    </w:p>
+    <w:p>
+      <w:pPr>
+        <w:jc w:val="both"/>
+        <w:rPr>
+          <w:sz w:val="22"/>
+          <w:szCs w:val="22"/>
+        </w:rPr>
+      </w:pPr>
+      <w:r>
+        <w:rPr>
+          <w:sz w:val="22"/>
+          <w:szCs w:val="22"/>
         </w:rPr>
         <w:lastRenderedPageBreak/>
-        <w:t xml:space="preserve">- Créer, modifier et supprimer clients, dossiers, notes, documents et factures </w:t>
-      </w:r>
-    </w:p>
-    <w:p>
-      <w:pPr>
-        <w:rPr>
-          <w:sz w:val="32"/>
-          <w:szCs w:val="32"/>
-        </w:rPr>
-      </w:pPr>
-    </w:p>
-    <w:p>
-      <w:pPr>
-        <w:rPr>
-          <w:sz w:val="32"/>
-          <w:szCs w:val="32"/>
-        </w:rPr>
-      </w:pPr>
-      <w:r>
-        <w:rPr>
-          <w:sz w:val="32"/>
-          <w:szCs w:val="32"/>
-        </w:rPr>
-        <w:t>Employé :</w:t>
-      </w:r>
-    </w:p>
-    <w:p>
-      <w:pPr>
-        <w:rPr>
-          <w:sz w:val="32"/>
-          <w:szCs w:val="32"/>
-        </w:rPr>
-      </w:pPr>
-      <w:r>
-        <w:rPr>
-          <w:sz w:val="32"/>
-          <w:szCs w:val="32"/>
+        <w:t>Utilisateur</w:t>
+      </w:r>
+      <w:r>
+        <w:rPr>
+          <w:sz w:val="22"/>
+          <w:szCs w:val="22"/>
+        </w:rPr>
+        <w:t xml:space="preserve"> </w:t>
+      </w:r>
+      <w:r>
+        <w:rPr>
+          <w:sz w:val="22"/>
+          <w:szCs w:val="22"/>
+        </w:rPr>
+        <w:t>(</w:t>
+      </w:r>
+      <w:r>
+        <w:rPr>
+          <w:sz w:val="22"/>
+          <w:szCs w:val="22"/>
+        </w:rPr>
+        <w:t>Employé</w:t>
+      </w:r>
+      <w:r>
+        <w:rPr>
+          <w:sz w:val="22"/>
+          <w:szCs w:val="22"/>
+        </w:rPr>
+        <w:t>)</w:t>
+      </w:r>
+      <w:r>
+        <w:rPr>
+          <w:sz w:val="22"/>
+          <w:szCs w:val="22"/>
+        </w:rPr>
+        <w:t> :</w:t>
+      </w:r>
+    </w:p>
+    <w:p>
+      <w:pPr>
+        <w:jc w:val="both"/>
+        <w:rPr>
+          <w:sz w:val="22"/>
+          <w:szCs w:val="22"/>
+        </w:rPr>
+      </w:pPr>
+      <w:r>
+        <w:rPr>
+          <w:sz w:val="22"/>
+          <w:szCs w:val="22"/>
         </w:rPr>
         <w:t xml:space="preserve">Se connecter au système </w:t>
       </w:r>
     </w:p>
     <w:p>
       <w:pPr>
-        <w:rPr>
-          <w:sz w:val="32"/>
-          <w:szCs w:val="32"/>
-        </w:rPr>
-      </w:pPr>
-      <w:r>
-        <w:rPr>
-          <w:sz w:val="32"/>
-          <w:szCs w:val="32"/>
+        <w:jc w:val="both"/>
+        <w:rPr>
+          <w:sz w:val="22"/>
+          <w:szCs w:val="22"/>
+        </w:rPr>
+      </w:pPr>
+      <w:r>
+        <w:rPr>
+          <w:sz w:val="22"/>
+          <w:szCs w:val="22"/>
         </w:rPr>
         <w:t xml:space="preserve">- Consulter les clients </w:t>
       </w:r>
     </w:p>
     <w:p>
       <w:pPr>
-        <w:rPr>
-          <w:sz w:val="32"/>
-          <w:szCs w:val="32"/>
-        </w:rPr>
-      </w:pPr>
-      <w:r>
-        <w:rPr>
-          <w:sz w:val="32"/>
-          <w:szCs w:val="32"/>
+        <w:jc w:val="both"/>
+        <w:rPr>
+          <w:sz w:val="22"/>
+          <w:szCs w:val="22"/>
+        </w:rPr>
+      </w:pPr>
+      <w:r>
+        <w:rPr>
+          <w:sz w:val="22"/>
+          <w:szCs w:val="22"/>
         </w:rPr>
         <w:t xml:space="preserve">- Créer et mettre à jour les dossiers dont il est responsable </w:t>
       </w:r>
     </w:p>
     <w:p>
       <w:pPr>
-        <w:rPr>
-          <w:sz w:val="32"/>
-          <w:szCs w:val="32"/>
-        </w:rPr>
-      </w:pPr>
-      <w:r>
-        <w:rPr>
-          <w:sz w:val="32"/>
-          <w:szCs w:val="32"/>
+        <w:jc w:val="both"/>
+        <w:rPr>
+          <w:sz w:val="22"/>
+          <w:szCs w:val="22"/>
+        </w:rPr>
+      </w:pPr>
+      <w:r>
+        <w:rPr>
+          <w:sz w:val="22"/>
+          <w:szCs w:val="22"/>
         </w:rPr>
         <w:t xml:space="preserve">- Ajouter des notes et des documents </w:t>
       </w:r>
     </w:p>
     <w:p>
       <w:pPr>
-        <w:rPr>
-          <w:sz w:val="32"/>
-          <w:szCs w:val="32"/>
-        </w:rPr>
-      </w:pPr>
-      <w:r>
-        <w:rPr>
-          <w:sz w:val="32"/>
-          <w:szCs w:val="32"/>
+        <w:jc w:val="both"/>
+        <w:rPr>
+          <w:sz w:val="22"/>
+          <w:szCs w:val="22"/>
+        </w:rPr>
+      </w:pPr>
+      <w:r>
+        <w:rPr>
+          <w:sz w:val="22"/>
+          <w:szCs w:val="22"/>
         </w:rPr>
         <w:t>- Créer des factures</w:t>
       </w:r>
     </w:p>
     <w:p>
       <w:pPr>
-        <w:rPr>
-          <w:sz w:val="32"/>
-          <w:szCs w:val="32"/>
-        </w:rPr>
-      </w:pPr>
-    </w:p>
-    <w:p>
-      <w:pPr>
-        <w:rPr>
-          <w:sz w:val="32"/>
-          <w:szCs w:val="32"/>
-        </w:rPr>
-      </w:pPr>
-      <w:r>
-        <w:rPr>
-          <w:sz w:val="32"/>
-          <w:szCs w:val="32"/>
+        <w:jc w:val="both"/>
+        <w:rPr>
+          <w:sz w:val="22"/>
+          <w:szCs w:val="22"/>
+        </w:rPr>
+      </w:pPr>
+    </w:p>
+    <w:p>
+      <w:pPr>
+        <w:jc w:val="both"/>
+        <w:rPr>
+          <w:sz w:val="22"/>
+          <w:szCs w:val="22"/>
+        </w:rPr>
+      </w:pPr>
+      <w:r>
+        <w:rPr>
+          <w:sz w:val="22"/>
+          <w:szCs w:val="22"/>
         </w:rPr>
         <w:t>Clients :</w:t>
       </w:r>
     </w:p>
     <w:p>
       <w:pPr>
-        <w:rPr>
-          <w:sz w:val="32"/>
-          <w:szCs w:val="32"/>
-        </w:rPr>
-      </w:pPr>
-      <w:r>
-        <w:rPr>
-          <w:sz w:val="32"/>
-          <w:szCs w:val="32"/>
+        <w:jc w:val="both"/>
+        <w:rPr>
+          <w:sz w:val="22"/>
+          <w:szCs w:val="22"/>
+        </w:rPr>
+      </w:pPr>
+      <w:r>
+        <w:rPr>
+          <w:sz w:val="22"/>
+          <w:szCs w:val="22"/>
         </w:rPr>
         <w:t>S'enregistrer dans le système</w:t>
       </w:r>
     </w:p>
     <w:p>
       <w:pPr>
-        <w:rPr>
-          <w:sz w:val="32"/>
-          <w:szCs w:val="32"/>
-        </w:rPr>
-      </w:pPr>
-      <w:r>
-        <w:rPr>
-          <w:sz w:val="32"/>
-          <w:szCs w:val="32"/>
-        </w:rPr>
-        <w:t>- Faire des requê</w:t>
-      </w:r>
-      <w:r>
-        <w:rPr>
-          <w:sz w:val="32"/>
-          <w:szCs w:val="32"/>
-        </w:rPr>
-        <w:t>tes</w:t>
-      </w:r>
-      <w:r>
-        <w:rPr>
-          <w:sz w:val="32"/>
-          <w:szCs w:val="32"/>
-        </w:rPr>
-        <w:t xml:space="preserve"> au système</w:t>
-      </w:r>
-    </w:p>
-    <w:p>
-      <w:pPr>
-        <w:rPr>
-          <w:sz w:val="32"/>
-          <w:szCs w:val="32"/>
-        </w:rPr>
-      </w:pPr>
-    </w:p>
-    <w:p>
-      <w:pPr>
-        <w:rPr>
-          <w:sz w:val="32"/>
-          <w:szCs w:val="32"/>
-        </w:rPr>
-      </w:pPr>
-      <w:r>
-        <w:rPr>
-          <w:sz w:val="32"/>
-          <w:szCs w:val="32"/>
+        <w:jc w:val="both"/>
+        <w:rPr>
+          <w:sz w:val="22"/>
+          <w:szCs w:val="22"/>
+        </w:rPr>
+      </w:pPr>
+      <w:r>
+        <w:rPr>
+          <w:sz w:val="22"/>
+          <w:szCs w:val="22"/>
+        </w:rPr>
+        <w:t>- Faire des requêtes au système</w:t>
+      </w:r>
+    </w:p>
+    <w:p>
+      <w:pPr>
+        <w:jc w:val="both"/>
+        <w:rPr>
+          <w:sz w:val="22"/>
+          <w:szCs w:val="22"/>
+        </w:rPr>
+      </w:pPr>
+      <w:r>
+        <w:rPr>
+          <w:sz w:val="22"/>
+          <w:szCs w:val="22"/>
+        </w:rPr>
+        <w:t xml:space="preserve">- Voir </w:t>
+      </w:r>
+      <w:r>
+        <w:rPr>
+          <w:sz w:val="22"/>
+          <w:szCs w:val="22"/>
+        </w:rPr>
+        <w:t>le suivi de leur demande</w:t>
+      </w:r>
+    </w:p>
+    <w:p>
+      <w:pPr>
+        <w:jc w:val="both"/>
+        <w:rPr>
+          <w:sz w:val="22"/>
+          <w:szCs w:val="22"/>
+        </w:rPr>
+      </w:pPr>
+    </w:p>
+    <w:p>
+      <w:pPr>
+        <w:jc w:val="both"/>
+        <w:rPr>
+          <w:sz w:val="22"/>
+          <w:szCs w:val="22"/>
+        </w:rPr>
+      </w:pPr>
+      <w:r>
+        <w:rPr>
+          <w:sz w:val="22"/>
+          <w:szCs w:val="22"/>
         </w:rPr>
         <w:t xml:space="preserve">Fonctionnalité possible : </w:t>
       </w:r>
     </w:p>
     <w:p>
       <w:pPr>
-        <w:rPr>
-          <w:sz w:val="32"/>
-          <w:szCs w:val="32"/>
-        </w:rPr>
-      </w:pPr>
-      <w:r>
-        <w:rPr>
-          <w:sz w:val="32"/>
-          <w:szCs w:val="32"/>
-        </w:rPr>
-        <w:t>Creer un groupe d'utilisateur dont les permissions auront été fait au préalable</w:t>
-      </w:r>
-    </w:p>
-    <w:p>
-      <w:pPr>
-        <w:rPr>
-          <w:sz w:val="32"/>
-          <w:szCs w:val="32"/>
-        </w:rPr>
-      </w:pPr>
-      <w:r>
-        <w:rPr>
-          <w:sz w:val="32"/>
-          <w:szCs w:val="32"/>
-        </w:rPr>
-        <w:t xml:space="preserve">Le client est relié à un dossier contenant des documents. </w:t>
-      </w:r>
-    </w:p>
-    <w:p>
-      <w:pPr>
-        <w:rPr>
-          <w:sz w:val="32"/>
-          <w:szCs w:val="32"/>
-        </w:rPr>
-      </w:pPr>
-    </w:p>
-    <w:p>
-      <w:pPr>
-        <w:rPr>
-          <w:sz w:val="32"/>
-          <w:szCs w:val="32"/>
-        </w:rPr>
-      </w:pPr>
-    </w:p>
-    <w:p>
-      <w:pPr>
+        <w:jc w:val="both"/>
+        <w:rPr>
+          <w:sz w:val="22"/>
+          <w:szCs w:val="22"/>
+        </w:rPr>
+      </w:pPr>
+      <w:r>
+        <w:rPr>
+          <w:sz w:val="22"/>
+          <w:szCs w:val="22"/>
+        </w:rPr>
+        <w:t>Cr</w:t>
+      </w:r>
+      <w:r>
+        <w:rPr>
+          <w:sz w:val="22"/>
+          <w:szCs w:val="22"/>
+        </w:rPr>
+        <w:t>é</w:t>
+      </w:r>
+      <w:r>
+        <w:rPr>
+          <w:sz w:val="22"/>
+          <w:szCs w:val="22"/>
+        </w:rPr>
+        <w:t>er un groupe d'utilisateur dont les permissions auront été fait au préalable</w:t>
+      </w:r>
+    </w:p>
+    <w:p>
+      <w:pPr>
+        <w:jc w:val="both"/>
+        <w:rPr>
+          <w:sz w:val="22"/>
+          <w:szCs w:val="22"/>
+        </w:rPr>
+      </w:pPr>
+      <w:r>
+        <w:rPr>
+          <w:sz w:val="22"/>
+          <w:szCs w:val="22"/>
+        </w:rPr>
+        <w:t xml:space="preserve">Le client est relié à un dossier contenant </w:t>
+      </w:r>
+      <w:r>
+        <w:rPr>
+          <w:sz w:val="22"/>
+          <w:szCs w:val="22"/>
+        </w:rPr>
+        <w:t>s</w:t>
+      </w:r>
+      <w:r>
+        <w:rPr>
+          <w:sz w:val="22"/>
+          <w:szCs w:val="22"/>
+        </w:rPr>
+        <w:t>es documents</w:t>
+      </w:r>
+      <w:r>
+        <w:rPr>
+          <w:sz w:val="22"/>
+          <w:szCs w:val="22"/>
+        </w:rPr>
+        <w:t xml:space="preserve"> / ses informations</w:t>
+      </w:r>
+      <w:r>
+        <w:rPr>
+          <w:sz w:val="22"/>
+          <w:szCs w:val="22"/>
+        </w:rPr>
+        <w:t xml:space="preserve">. </w:t>
+      </w:r>
+    </w:p>
+    <w:p>
+      <w:pPr>
+        <w:jc w:val="both"/>
+        <w:rPr>
+          <w:sz w:val="22"/>
+          <w:szCs w:val="22"/>
+        </w:rPr>
+      </w:pPr>
+    </w:p>
+    <w:p>
+      <w:pPr>
+        <w:jc w:val="both"/>
+        <w:rPr>
+          <w:sz w:val="22"/>
+          <w:szCs w:val="22"/>
+        </w:rPr>
+      </w:pPr>
+    </w:p>
+    <w:p>
+      <w:pPr>
+        <w:jc w:val="both"/>
         <w:rPr>
           <w:b/>
           <w:bCs/>
-          <w:sz w:val="36"/>
-          <w:szCs w:val="36"/>
+          <w:sz w:val="22"/>
+          <w:szCs w:val="22"/>
           <w:u w:val="single"/>
         </w:rPr>
       </w:pPr>
@@ -1111,8 +1416,8 @@
         <w:rPr>
           <w:b/>
           <w:bCs/>
-          <w:sz w:val="36"/>
-          <w:szCs w:val="36"/>
+          <w:sz w:val="22"/>
+          <w:szCs w:val="22"/>
           <w:u w:val="single"/>
         </w:rPr>
         <w:t>Hypothèse</w:t>
@@ -1121,8 +1426,8 @@
         <w:rPr>
           <w:b/>
           <w:bCs/>
-          <w:sz w:val="36"/>
-          <w:szCs w:val="36"/>
+          <w:sz w:val="22"/>
+          <w:szCs w:val="22"/>
           <w:u w:val="single"/>
         </w:rPr>
         <w:t>s</w:t>
@@ -1131,8 +1436,8 @@
         <w:rPr>
           <w:b/>
           <w:bCs/>
-          <w:sz w:val="36"/>
-          <w:szCs w:val="36"/>
+          <w:sz w:val="22"/>
+          <w:szCs w:val="22"/>
           <w:u w:val="single"/>
         </w:rPr>
         <w:t xml:space="preserve"> et limites du système</w:t>
@@ -1140,128 +1445,94 @@
     </w:p>
     <w:p>
       <w:pPr>
-        <w:rPr>
-          <w:sz w:val="32"/>
-          <w:szCs w:val="32"/>
-        </w:rPr>
-      </w:pPr>
-      <w:r>
-        <w:rPr>
-          <w:sz w:val="32"/>
-          <w:szCs w:val="32"/>
-        </w:rPr>
-        <w:lastRenderedPageBreak/>
+        <w:jc w:val="both"/>
+        <w:rPr>
+          <w:sz w:val="22"/>
+          <w:szCs w:val="22"/>
+        </w:rPr>
+      </w:pPr>
+      <w:r>
+        <w:rPr>
+          <w:sz w:val="22"/>
+          <w:szCs w:val="22"/>
+        </w:rPr>
         <w:t>Le système ne communique pas directement avec les plateformes gouvernementales.</w:t>
       </w:r>
     </w:p>
     <w:p>
       <w:pPr>
-        <w:rPr>
-          <w:sz w:val="32"/>
-          <w:szCs w:val="32"/>
-        </w:rPr>
-      </w:pPr>
-    </w:p>
-    <w:p>
-      <w:pPr>
-        <w:rPr>
-          <w:sz w:val="32"/>
-          <w:szCs w:val="32"/>
-        </w:rPr>
-      </w:pPr>
-      <w:r>
-        <w:rPr>
-          <w:sz w:val="32"/>
-          <w:szCs w:val="32"/>
+        <w:jc w:val="both"/>
+        <w:rPr>
+          <w:sz w:val="22"/>
+          <w:szCs w:val="22"/>
+        </w:rPr>
+      </w:pPr>
+    </w:p>
+    <w:p>
+      <w:pPr>
+        <w:jc w:val="both"/>
+        <w:rPr>
+          <w:sz w:val="22"/>
+          <w:szCs w:val="22"/>
+        </w:rPr>
+      </w:pPr>
+      <w:r>
+        <w:rPr>
+          <w:sz w:val="22"/>
+          <w:szCs w:val="22"/>
         </w:rPr>
         <w:t>Il ne traite pas les paiements en ligne (gestion interne seulement).</w:t>
       </w:r>
     </w:p>
     <w:p>
       <w:pPr>
-        <w:rPr>
-          <w:sz w:val="32"/>
-          <w:szCs w:val="32"/>
-        </w:rPr>
-      </w:pPr>
-    </w:p>
-    <w:p>
-      <w:pPr>
-        <w:rPr>
-          <w:sz w:val="32"/>
-          <w:szCs w:val="32"/>
-        </w:rPr>
-      </w:pPr>
-      <w:r>
-        <w:rPr>
-          <w:sz w:val="32"/>
-          <w:szCs w:val="32"/>
+        <w:jc w:val="both"/>
+        <w:rPr>
+          <w:sz w:val="22"/>
+          <w:szCs w:val="22"/>
+        </w:rPr>
+      </w:pPr>
+    </w:p>
+    <w:p>
+      <w:pPr>
+        <w:jc w:val="both"/>
+        <w:rPr>
+          <w:sz w:val="22"/>
+          <w:szCs w:val="22"/>
+        </w:rPr>
+      </w:pPr>
+      <w:r>
+        <w:rPr>
+          <w:sz w:val="22"/>
+          <w:szCs w:val="22"/>
         </w:rPr>
         <w:t>Il ne prend pas de décisions automatiques sur l’acceptation ou le refus des dossiers.</w:t>
       </w:r>
     </w:p>
     <w:p>
       <w:pPr>
-        <w:rPr>
-          <w:sz w:val="32"/>
-          <w:szCs w:val="32"/>
-        </w:rPr>
-      </w:pPr>
-    </w:p>
-    <w:p>
-      <w:pPr>
-        <w:rPr>
-          <w:sz w:val="32"/>
-          <w:szCs w:val="32"/>
-        </w:rPr>
-      </w:pPr>
-      <w:r>
-        <w:rPr>
-          <w:sz w:val="32"/>
-          <w:szCs w:val="32"/>
+        <w:jc w:val="both"/>
+        <w:rPr>
+          <w:sz w:val="22"/>
+          <w:szCs w:val="22"/>
+        </w:rPr>
+      </w:pPr>
+    </w:p>
+    <w:p>
+      <w:pPr>
+        <w:jc w:val="both"/>
+        <w:rPr>
+          <w:sz w:val="22"/>
+          <w:szCs w:val="22"/>
+        </w:rPr>
+      </w:pPr>
+      <w:r>
+        <w:rPr>
+          <w:sz w:val="22"/>
+          <w:szCs w:val="22"/>
         </w:rPr>
         <w:t>La sécurité repose sur les mesures mises en place par le cabinet (sauvegardes, mots de passe, etc.).</w:t>
       </w:r>
-    </w:p>
-    <w:p>
-      <w:pPr>
-        <w:rPr>
-          <w:sz w:val="32"/>
-          <w:szCs w:val="32"/>
-        </w:rPr>
-      </w:pPr>
-    </w:p>
-    <w:p>
-      <w:pPr>
-        <w:rPr>
-          <w:sz w:val="32"/>
-          <w:szCs w:val="32"/>
-        </w:rPr>
-      </w:pPr>
-    </w:p>
-    <w:p>
-      <w:pPr>
-        <w:rPr>
-          <w:sz w:val="32"/>
-          <w:szCs w:val="32"/>
-        </w:rPr>
-      </w:pPr>
-    </w:p>
-    <w:p>
-      <w:pPr>
-        <w:rPr>
-          <w:sz w:val="32"/>
-          <w:szCs w:val="32"/>
-        </w:rPr>
-      </w:pPr>
-    </w:p>
-    <w:p>
-      <w:pPr>
-        <w:rPr>
-          <w:sz w:val="32"/>
-          <w:szCs w:val="32"/>
-        </w:rPr>
-      </w:pPr>
     </w:p>
     <w:sectPr>
       <w:pgSz w:w="12240" w:h="15840"/>
@@ -1475,6 +1746,207 @@
     </w:lvl>
   </w:abstractNum>
   <w:abstractNum w:abstractNumId="1" w15:restartNumberingAfterBreak="0">
+    <w:nsid w:val="31EF63D3"/>
+    <w:multiLevelType w:val="hybridMultilevel"/>
+    <w:tmpl w:val="50E6E268"/>
+    <w:lvl w:ilvl="0" w:tplc="0C0C000F">
+      <w:start w:val="1"/>
+      <w:numFmt w:val="decimal"/>
+      <w:lvlText w:val="%1."/>
+      <w:lvlJc w:val="left"/>
+      <w:pPr>
+        <w:ind w:left="720" w:hanging="360"/>
+      </w:pPr>
+      <w:rPr>
+        <w:rFonts w:hint="default"/>
+      </w:rPr>
+    </w:lvl>
+    <w:lvl w:ilvl="1" w:tplc="0C0C0019" w:tentative="1">
+      <w:start w:val="1"/>
+      <w:numFmt w:val="lowerLetter"/>
+      <w:lvlText w:val="%2."/>
+      <w:lvlJc w:val="left"/>
+      <w:pPr>
+        <w:ind w:left="1440" w:hanging="360"/>
+      </w:pPr>
+    </w:lvl>
+    <w:lvl w:ilvl="2" w:tplc="0C0C001B" w:tentative="1">
+      <w:start w:val="1"/>
+      <w:numFmt w:val="lowerRoman"/>
+      <w:lvlText w:val="%3."/>
+      <w:lvlJc w:val="right"/>
+      <w:pPr>
+        <w:ind w:left="2160" w:hanging="180"/>
+      </w:pPr>
+    </w:lvl>
+    <w:lvl w:ilvl="3" w:tplc="0C0C000F" w:tentative="1">
+      <w:start w:val="1"/>
+      <w:numFmt w:val="decimal"/>
+      <w:lvlText w:val="%4."/>
+      <w:lvlJc w:val="left"/>
+      <w:pPr>
+        <w:ind w:left="2880" w:hanging="360"/>
+      </w:pPr>
+    </w:lvl>
+    <w:lvl w:ilvl="4" w:tplc="0C0C0019" w:tentative="1">
+      <w:start w:val="1"/>
+      <w:numFmt w:val="lowerLetter"/>
+      <w:lvlText w:val="%5."/>
+      <w:lvlJc w:val="left"/>
+      <w:pPr>
+        <w:ind w:left="3600" w:hanging="360"/>
+      </w:pPr>
+    </w:lvl>
+    <w:lvl w:ilvl="5" w:tplc="0C0C001B" w:tentative="1">
+      <w:start w:val="1"/>
+      <w:numFmt w:val="lowerRoman"/>
+      <w:lvlText w:val="%6."/>
+      <w:lvlJc w:val="right"/>
+      <w:pPr>
+        <w:ind w:left="4320" w:hanging="180"/>
+      </w:pPr>
+    </w:lvl>
+    <w:lvl w:ilvl="6" w:tplc="0C0C000F" w:tentative="1">
+      <w:start w:val="1"/>
+      <w:numFmt w:val="decimal"/>
+      <w:lvlText w:val="%7."/>
+      <w:lvlJc w:val="left"/>
+      <w:pPr>
+        <w:ind w:left="5040" w:hanging="360"/>
+      </w:pPr>
+    </w:lvl>
+    <w:lvl w:ilvl="7" w:tplc="0C0C0019" w:tentative="1">
+      <w:start w:val="1"/>
+      <w:numFmt w:val="lowerLetter"/>
+      <w:lvlText w:val="%8."/>
+      <w:lvlJc w:val="left"/>
+      <w:pPr>
+        <w:ind w:left="5760" w:hanging="360"/>
+      </w:pPr>
+    </w:lvl>
+    <w:lvl w:ilvl="8" w:tplc="0C0C001B" w:tentative="1">
+      <w:start w:val="1"/>
+      <w:numFmt w:val="lowerRoman"/>
+      <w:lvlText w:val="%9."/>
+      <w:lvlJc w:val="right"/>
+      <w:pPr>
+        <w:ind w:left="6480" w:hanging="180"/>
+      </w:pPr>
+    </w:lvl>
+  </w:abstractNum>
+  <w:abstractNum w:abstractNumId="2" w15:restartNumberingAfterBreak="0">
+    <w:nsid w:val="3A187C2A"/>
+    <w:multiLevelType w:val="hybridMultilevel"/>
+    <w:tmpl w:val="B76419DE"/>
+    <w:lvl w:ilvl="0" w:tplc="D346CDAC">
+      <w:numFmt w:val="bullet"/>
+      <w:lvlText w:val="-"/>
+      <w:lvlJc w:val="left"/>
+      <w:pPr>
+        <w:ind w:left="720" w:hanging="360"/>
+      </w:pPr>
+      <w:rPr>
+        <w:rFonts w:ascii="Aptos" w:eastAsiaTheme="minorHAnsi" w:hAnsi="Aptos" w:cstheme="minorBidi" w:hint="default"/>
+      </w:rPr>
+    </w:lvl>
+    <w:lvl w:ilvl="1" w:tplc="0C0C0003" w:tentative="1">
+      <w:start w:val="1"/>
+      <w:numFmt w:val="bullet"/>
+      <w:lvlText w:val="o"/>
+      <w:lvlJc w:val="left"/>
+      <w:pPr>
+        <w:ind w:left="1440" w:hanging="360"/>
+      </w:pPr>
+      <w:rPr>
+        <w:rFonts w:ascii="Courier New" w:hAnsi="Courier New" w:cs="Courier New" w:hint="default"/>
+      </w:rPr>
+    </w:lvl>
+    <w:lvl w:ilvl="2" w:tplc="0C0C0005" w:tentative="1">
+      <w:start w:val="1"/>
+      <w:numFmt w:val="bullet"/>
+      <w:lvlText w:val=""/>
+      <w:lvlJc w:val="left"/>
+      <w:pPr>
+        <w:ind w:left="2160" w:hanging="360"/>
+      </w:pPr>
+      <w:rPr>
+        <w:rFonts w:ascii="Wingdings" w:hAnsi="Wingdings" w:hint="default"/>
+      </w:rPr>
+    </w:lvl>
+    <w:lvl w:ilvl="3" w:tplc="0C0C0001" w:tentative="1">
+      <w:start w:val="1"/>
+      <w:numFmt w:val="bullet"/>
+      <w:lvlText w:val=""/>
+      <w:lvlJc w:val="left"/>
+      <w:pPr>
+        <w:ind w:left="2880" w:hanging="360"/>
+      </w:pPr>
+      <w:rPr>
+        <w:rFonts w:ascii="Symbol" w:hAnsi="Symbol" w:hint="default"/>
+      </w:rPr>
+    </w:lvl>
+    <w:lvl w:ilvl="4" w:tplc="0C0C0003" w:tentative="1">
+      <w:start w:val="1"/>
+      <w:numFmt w:val="bullet"/>
+      <w:lvlText w:val="o"/>
+      <w:lvlJc w:val="left"/>
+      <w:pPr>
+        <w:ind w:left="3600" w:hanging="360"/>
+      </w:pPr>
+      <w:rPr>
+        <w:rFonts w:ascii="Courier New" w:hAnsi="Courier New" w:cs="Courier New" w:hint="default"/>
+      </w:rPr>
+    </w:lvl>
+    <w:lvl w:ilvl="5" w:tplc="0C0C0005" w:tentative="1">
+      <w:start w:val="1"/>
+      <w:numFmt w:val="bullet"/>
+      <w:lvlText w:val=""/>
+      <w:lvlJc w:val="left"/>
+      <w:pPr>
+        <w:ind w:left="4320" w:hanging="360"/>
+      </w:pPr>
+      <w:rPr>
+        <w:rFonts w:ascii="Wingdings" w:hAnsi="Wingdings" w:hint="default"/>
+      </w:rPr>
+    </w:lvl>
+    <w:lvl w:ilvl="6" w:tplc="0C0C0001" w:tentative="1">
+      <w:start w:val="1"/>
+      <w:numFmt w:val="bullet"/>
+      <w:lvlText w:val=""/>
+      <w:lvlJc w:val="left"/>
+      <w:pPr>
+        <w:ind w:left="5040" w:hanging="360"/>
+      </w:pPr>
+      <w:rPr>
+        <w:rFonts w:ascii="Symbol" w:hAnsi="Symbol" w:hint="default"/>
+      </w:rPr>
+    </w:lvl>
+    <w:lvl w:ilvl="7" w:tplc="0C0C0003" w:tentative="1">
+      <w:start w:val="1"/>
+      <w:numFmt w:val="bullet"/>
+      <w:lvlText w:val="o"/>
+      <w:lvlJc w:val="left"/>
+      <w:pPr>
+        <w:ind w:left="5760" w:hanging="360"/>
+      </w:pPr>
+      <w:rPr>
+        <w:rFonts w:ascii="Courier New" w:hAnsi="Courier New" w:cs="Courier New" w:hint="default"/>
+      </w:rPr>
+    </w:lvl>
+    <w:lvl w:ilvl="8" w:tplc="0C0C0005" w:tentative="1">
+      <w:start w:val="1"/>
+      <w:numFmt w:val="bullet"/>
+      <w:lvlText w:val=""/>
+      <w:lvlJc w:val="left"/>
+      <w:pPr>
+        <w:ind w:left="6480" w:hanging="360"/>
+      </w:pPr>
+      <w:rPr>
+        <w:rFonts w:ascii="Wingdings" w:hAnsi="Wingdings" w:hint="default"/>
+      </w:rPr>
+    </w:lvl>
+  </w:abstractNum>
+  <w:abstractNum w:abstractNumId="3" w15:restartNumberingAfterBreak="0">
     <w:nsid w:val="3CC752C1"/>
     <w:multiLevelType w:val="hybridMultilevel"/>
     <w:tmpl w:val="F3603B46"/>
@@ -1588,10 +2060,16 @@
     </w:lvl>
   </w:abstractNum>
   <w:num w:numId="1" w16cid:durableId="1851289805">
-    <w:abstractNumId w:val="1"/>
+    <w:abstractNumId w:val="3"/>
   </w:num>
   <w:num w:numId="2" w16cid:durableId="63266311">
     <w:abstractNumId w:val="0"/>
+  </w:num>
+  <w:num w:numId="3" w16cid:durableId="1558079857">
+    <w:abstractNumId w:val="2"/>
+  </w:num>
+  <w:num w:numId="4" w16cid:durableId="1032416577">
+    <w:abstractNumId w:val="1"/>
   </w:num>
 </w:numbering>
 </file>
@@ -2876,23 +3354,6 @@
 </file>
 
 <file path=customXml/item1.xml><?xml version="1.0" encoding="utf-8"?>
-<p:properties xmlns:p="http://schemas.microsoft.com/office/2006/metadata/properties" xmlns:xsi="http://www.w3.org/2001/XMLSchema-instance" xmlns:pc="http://schemas.microsoft.com/office/infopath/2007/PartnerControls">
-  <documentManagement>
-    <_activity xmlns="b2b4ec58-5772-4995-a3c2-31ca8a94073c" xsi:nil="true"/>
-  </documentManagement>
-</p:properties>
-</file>
-
-<file path=customXml/item2.xml><?xml version="1.0" encoding="utf-8"?>
-<?mso-contentType ?>
-<FormTemplates xmlns="http://schemas.microsoft.com/sharepoint/v3/contenttype/forms">
-  <Display>DocumentLibraryForm</Display>
-  <Edit>DocumentLibraryForm</Edit>
-  <New>DocumentLibraryForm</New>
-</FormTemplates>
-</file>
-
-<file path=customXml/item3.xml><?xml version="1.0" encoding="utf-8"?>
 <ct:contentTypeSchema xmlns:ct="http://schemas.microsoft.com/office/2006/metadata/contentType" xmlns:ma="http://schemas.microsoft.com/office/2006/metadata/properties/metaAttributes" ct:_="" ma:_="" ma:contentTypeName="Document" ma:contentTypeID="0x010100385F1B371E737F49B99795C0A0F59E71" ma:contentTypeVersion="10" ma:contentTypeDescription="Crée un document." ma:contentTypeScope="" ma:versionID="448806388b501fd098dcab7d9fec94fc">
   <xsd:schema xmlns:xsd="http://www.w3.org/2001/XMLSchema" xmlns:xs="http://www.w3.org/2001/XMLSchema" xmlns:p="http://schemas.microsoft.com/office/2006/metadata/properties" xmlns:ns3="b2b4ec58-5772-4995-a3c2-31ca8a94073c" targetNamespace="http://schemas.microsoft.com/office/2006/metadata/properties" ma:root="true" ma:fieldsID="0a816f0a39105d95595f70c82c7426bb" ns3:_="">
     <xsd:import namespace="b2b4ec58-5772-4995-a3c2-31ca8a94073c"/>
@@ -3074,25 +3535,24 @@
 </ct:contentTypeSchema>
 </file>
 
-<file path=customXml/itemProps1.xml><?xml version="1.0" encoding="utf-8"?>
-<ds:datastoreItem xmlns:ds="http://schemas.openxmlformats.org/officeDocument/2006/customXml" ds:itemID="{14CEE6E0-B436-4B4B-A617-8C8F517D9158}">
-  <ds:schemaRefs>
-    <ds:schemaRef ds:uri="http://schemas.microsoft.com/office/2006/metadata/properties"/>
-    <ds:schemaRef ds:uri="http://schemas.microsoft.com/office/infopath/2007/PartnerControls"/>
-    <ds:schemaRef ds:uri="b2b4ec58-5772-4995-a3c2-31ca8a94073c"/>
-  </ds:schemaRefs>
-</ds:datastoreItem>
+<file path=customXml/item2.xml><?xml version="1.0" encoding="utf-8"?>
+<?mso-contentType ?>
+<FormTemplates xmlns="http://schemas.microsoft.com/sharepoint/v3/contenttype/forms">
+  <Display>DocumentLibraryForm</Display>
+  <Edit>DocumentLibraryForm</Edit>
+  <New>DocumentLibraryForm</New>
+</FormTemplates>
 </file>
 
-<file path=customXml/itemProps2.xml><?xml version="1.0" encoding="utf-8"?>
-<ds:datastoreItem xmlns:ds="http://schemas.openxmlformats.org/officeDocument/2006/customXml" ds:itemID="{CBA6B957-6DB9-4A98-9F0E-F2CC47FE182F}">
-  <ds:schemaRefs>
-    <ds:schemaRef ds:uri="http://schemas.microsoft.com/sharepoint/v3/contenttype/forms"/>
-  </ds:schemaRefs>
-</ds:datastoreItem>
+<file path=customXml/item3.xml><?xml version="1.0" encoding="utf-8"?>
+<p:properties xmlns:p="http://schemas.microsoft.com/office/2006/metadata/properties" xmlns:xsi="http://www.w3.org/2001/XMLSchema-instance" xmlns:pc="http://schemas.microsoft.com/office/infopath/2007/PartnerControls">
+  <documentManagement>
+    <_activity xmlns="b2b4ec58-5772-4995-a3c2-31ca8a94073c" xsi:nil="true"/>
+  </documentManagement>
+</p:properties>
 </file>
 
-<file path=customXml/itemProps3.xml><?xml version="1.0" encoding="utf-8"?>
+<file path=customXml/itemProps1.xml><?xml version="1.0" encoding="utf-8"?>
 <ds:datastoreItem xmlns:ds="http://schemas.openxmlformats.org/officeDocument/2006/customXml" ds:itemID="{868B7C77-9F38-478A-B936-48AC6891DAFB}">
   <ds:schemaRefs>
     <ds:schemaRef ds:uri="http://schemas.microsoft.com/office/2006/metadata/contentType"/>
@@ -3108,4 +3568,22 @@
     <ds:schemaRef ds:uri="http://schemas.microsoft.com/internal/obd"/>
   </ds:schemaRefs>
 </ds:datastoreItem>
+</file>
+
+<file path=customXml/itemProps2.xml><?xml version="1.0" encoding="utf-8"?>
+<ds:datastoreItem xmlns:ds="http://schemas.openxmlformats.org/officeDocument/2006/customXml" ds:itemID="{CBA6B957-6DB9-4A98-9F0E-F2CC47FE182F}">
+  <ds:schemaRefs>
+    <ds:schemaRef ds:uri="http://schemas.microsoft.com/sharepoint/v3/contenttype/forms"/>
+  </ds:schemaRefs>
+</ds:datastoreItem>
+</file>
+
+<file path=customXml/itemProps3.xml><?xml version="1.0" encoding="utf-8"?>
+<ds:datastoreItem xmlns:ds="http://schemas.openxmlformats.org/officeDocument/2006/customXml" ds:itemID="{14CEE6E0-B436-4B4B-A617-8C8F517D9158}">
+  <ds:schemaRefs>
+    <ds:schemaRef ds:uri="http://schemas.microsoft.com/office/2006/metadata/properties"/>
+    <ds:schemaRef ds:uri="http://schemas.microsoft.com/office/infopath/2007/PartnerControls"/>
+    <ds:schemaRef ds:uri="b2b4ec58-5772-4995-a3c2-31ca8a94073c"/>
+  </ds:schemaRefs>
+</ds:datastoreItem>
 </file>
</xml_diff>